<commit_message>
fix bug in tam hop dong
</commit_message>
<xml_diff>
--- a/src/main/resources/templates/HopDongTheChap.docx
+++ b/src/main/resources/templates/HopDongTheChap.docx
@@ -140,7 +140,7 @@
                     </wp:anchor>
                   </w:drawing>
                 </mc:Choice>
-                <mc:Fallback xmlns:cx1="http://schemas.microsoft.com/office/drawing/2015/9/8/chartex" xmlns:cx2="http://schemas.microsoft.com/office/drawing/2015/10/21/chartex" xmlns:cx3="http://schemas.microsoft.com/office/drawing/2016/5/9/chartex" xmlns:cx4="http://schemas.microsoft.com/office/drawing/2016/5/10/chartex" xmlns:cx5="http://schemas.microsoft.com/office/drawing/2016/5/11/chartex" xmlns:cx6="http://schemas.microsoft.com/office/drawing/2016/5/12/chartex" xmlns:cx7="http://schemas.microsoft.com/office/drawing/2016/5/13/chartex" xmlns:cx8="http://schemas.microsoft.com/office/drawing/2016/5/14/chartex" xmlns:aink="http://schemas.microsoft.com/office/drawing/2016/ink" xmlns:am3d="http://schemas.microsoft.com/office/drawing/2017/model3d" xmlns:oel="http://schemas.microsoft.com/office/2019/extlst" xmlns:w16cex="http://schemas.microsoft.com/office/word/2018/wordml/cex" xmlns:w16cid="http://schemas.microsoft.com/office/word/2016/wordml/cid" xmlns:w16="http://schemas.microsoft.com/office/word/2018/wordml" xmlns:w16du="http://schemas.microsoft.com/office/word/2023/wordml/word16du" xmlns:w16sdtdh="http://schemas.microsoft.com/office/word/2020/wordml/sdtdatahash" xmlns:w16sdtfl="http://schemas.microsoft.com/office/word/2024/wordml/sdtformatlock">
+                <mc:Fallback xmlns:w16sdtfl="http://schemas.microsoft.com/office/word/2024/wordml/sdtformatlock" xmlns:w16sdtdh="http://schemas.microsoft.com/office/word/2020/wordml/sdtdatahash" xmlns:w16du="http://schemas.microsoft.com/office/word/2023/wordml/word16du" xmlns:w16="http://schemas.microsoft.com/office/word/2018/wordml" xmlns:w16cid="http://schemas.microsoft.com/office/word/2016/wordml/cid" xmlns:w16cex="http://schemas.microsoft.com/office/word/2018/wordml/cex" xmlns:oel="http://schemas.microsoft.com/office/2019/extlst" xmlns:am3d="http://schemas.microsoft.com/office/drawing/2017/model3d" xmlns:aink="http://schemas.microsoft.com/office/drawing/2016/ink" xmlns:cx8="http://schemas.microsoft.com/office/drawing/2016/5/14/chartex" xmlns:cx7="http://schemas.microsoft.com/office/drawing/2016/5/13/chartex" xmlns:cx6="http://schemas.microsoft.com/office/drawing/2016/5/12/chartex" xmlns:cx5="http://schemas.microsoft.com/office/drawing/2016/5/11/chartex" xmlns:cx4="http://schemas.microsoft.com/office/drawing/2016/5/10/chartex" xmlns:cx3="http://schemas.microsoft.com/office/drawing/2016/5/9/chartex" xmlns:cx2="http://schemas.microsoft.com/office/drawing/2015/10/21/chartex" xmlns:cx1="http://schemas.microsoft.com/office/drawing/2015/9/8/chartex">
                   <w:pict>
                     <v:line w14:anchorId="30654FD4" id="Straight Connector 1" o:spid="_x0000_s1026" style="position:absolute;flip:y;z-index:251659264;visibility:visible;mso-wrap-style:square;mso-height-percent:0;mso-wrap-distance-left:9pt;mso-wrap-distance-top:0;mso-wrap-distance-right:9pt;mso-wrap-distance-bottom:0;mso-position-horizontal:absolute;mso-position-horizontal-relative:text;mso-position-vertical:absolute;mso-position-vertical-relative:text;mso-height-percent:0;mso-height-relative:margin" from="170.8pt,17.45pt" to="303.55pt,17.45pt" o:gfxdata="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" strokecolor="#4579b8 [3044]"/>
                   </w:pict>
@@ -7722,19 +7722,7 @@
                 <w:szCs w:val="24"/>
                 <w:lang w:val="it-IT"/>
               </w:rPr>
-              <w:t xml:space="preserve">(Ký, ghi </w:t>
-            </w:r>
-            <w:bookmarkStart w:id="1" w:name="_GoBack"/>
-            <w:bookmarkEnd w:id="1"/>
-            <w:r>
-              <w:rPr>
-                <w:rFonts w:ascii="Times New Roman" w:hAnsi="Times New Roman" w:cs="Times New Roman"/>
-                <w:i/>
-                <w:sz w:val="24"/>
-                <w:szCs w:val="24"/>
-                <w:lang w:val="it-IT"/>
-              </w:rPr>
-              <w:t>rõ họ tên và đóng dấu)</w:t>
+              <w:t>(Ký, ghi rõ họ tên và đóng dấu)</w:t>
             </w:r>
           </w:p>
         </w:tc>
@@ -7743,184 +7731,16 @@
     <w:p>
       <w:pPr>
         <w:spacing w:after="0" w:line="288" w:lineRule="auto"/>
-        <w:ind w:firstLine="720"/>
-        <w:jc w:val="center"/>
         <w:rPr>
           <w:rFonts w:ascii="Times New Roman" w:eastAsia="Times New Roman" w:hAnsi="Times New Roman" w:cs="Times New Roman"/>
           <w:b/>
-          <w:sz w:val="24"/>
-          <w:szCs w:val="24"/>
-          <w:lang w:val="it-IT"/>
-        </w:rPr>
-      </w:pPr>
-    </w:p>
-    <w:p>
-      <w:pPr>
-        <w:spacing w:after="0" w:line="288" w:lineRule="auto"/>
-        <w:ind w:firstLine="720"/>
-        <w:jc w:val="center"/>
-        <w:rPr>
-          <w:rFonts w:ascii="Times New Roman" w:eastAsia="Times New Roman" w:hAnsi="Times New Roman" w:cs="Times New Roman"/>
-          <w:b/>
-          <w:sz w:val="24"/>
-          <w:szCs w:val="24"/>
-          <w:lang w:val="it-IT"/>
-        </w:rPr>
-      </w:pPr>
-    </w:p>
-    <w:p>
-      <w:pPr>
-        <w:spacing w:after="0" w:line="288" w:lineRule="auto"/>
-        <w:ind w:firstLine="720"/>
-        <w:jc w:val="center"/>
-        <w:rPr>
-          <w:rFonts w:ascii="Times New Roman" w:eastAsia="Times New Roman" w:hAnsi="Times New Roman" w:cs="Times New Roman"/>
-          <w:b/>
-          <w:sz w:val="24"/>
-          <w:szCs w:val="24"/>
-          <w:lang w:val="it-IT"/>
-        </w:rPr>
-      </w:pPr>
-    </w:p>
-    <w:p>
-      <w:pPr>
-        <w:spacing w:after="0" w:line="288" w:lineRule="auto"/>
-        <w:ind w:firstLine="720"/>
-        <w:jc w:val="center"/>
-        <w:rPr>
-          <w:rFonts w:ascii="Times New Roman" w:eastAsia="Times New Roman" w:hAnsi="Times New Roman" w:cs="Times New Roman"/>
-          <w:b/>
-          <w:sz w:val="24"/>
-          <w:szCs w:val="24"/>
-          <w:lang w:val="it-IT"/>
-        </w:rPr>
-      </w:pPr>
-    </w:p>
-    <w:p>
-      <w:pPr>
-        <w:spacing w:after="0" w:line="288" w:lineRule="auto"/>
-        <w:ind w:firstLine="720"/>
-        <w:jc w:val="center"/>
-        <w:rPr>
-          <w:rFonts w:ascii="Times New Roman" w:eastAsia="Times New Roman" w:hAnsi="Times New Roman" w:cs="Times New Roman"/>
-          <w:b/>
-          <w:sz w:val="24"/>
-          <w:szCs w:val="24"/>
-          <w:lang w:val="it-IT"/>
-        </w:rPr>
-      </w:pPr>
-    </w:p>
-    <w:p>
-      <w:pPr>
-        <w:spacing w:after="0" w:line="288" w:lineRule="auto"/>
-        <w:ind w:firstLine="720"/>
-        <w:jc w:val="center"/>
-        <w:rPr>
-          <w:rFonts w:ascii="Times New Roman" w:eastAsia="Times New Roman" w:hAnsi="Times New Roman" w:cs="Times New Roman"/>
-          <w:b/>
-          <w:sz w:val="24"/>
-          <w:szCs w:val="24"/>
-          <w:lang w:val="it-IT"/>
-        </w:rPr>
-      </w:pPr>
-    </w:p>
-    <w:p>
-      <w:pPr>
-        <w:spacing w:after="0" w:line="288" w:lineRule="auto"/>
-        <w:ind w:firstLine="720"/>
-        <w:jc w:val="center"/>
-        <w:rPr>
-          <w:rFonts w:ascii="Times New Roman" w:eastAsia="Times New Roman" w:hAnsi="Times New Roman" w:cs="Times New Roman"/>
-          <w:b/>
-          <w:sz w:val="26"/>
-          <w:szCs w:val="26"/>
-          <w:lang w:val="it-IT"/>
-        </w:rPr>
-      </w:pPr>
-    </w:p>
-    <w:p>
-      <w:pPr>
-        <w:spacing w:after="0" w:line="288" w:lineRule="auto"/>
-        <w:ind w:firstLine="720"/>
-        <w:jc w:val="center"/>
-        <w:rPr>
-          <w:rFonts w:ascii="Times New Roman" w:eastAsia="Times New Roman" w:hAnsi="Times New Roman" w:cs="Times New Roman"/>
-          <w:b/>
-          <w:sz w:val="26"/>
-          <w:szCs w:val="26"/>
-          <w:lang w:val="it-IT"/>
-        </w:rPr>
-      </w:pPr>
-    </w:p>
-    <w:p>
-      <w:pPr>
-        <w:spacing w:after="0" w:line="288" w:lineRule="auto"/>
-        <w:ind w:firstLine="720"/>
-        <w:jc w:val="center"/>
-        <w:rPr>
-          <w:rFonts w:ascii="Times New Roman" w:eastAsia="Times New Roman" w:hAnsi="Times New Roman" w:cs="Times New Roman"/>
-          <w:b/>
-          <w:sz w:val="26"/>
-          <w:szCs w:val="26"/>
-          <w:lang w:val="it-IT"/>
-        </w:rPr>
-      </w:pPr>
-    </w:p>
-    <w:p>
-      <w:pPr>
-        <w:spacing w:after="0" w:line="288" w:lineRule="auto"/>
-        <w:ind w:firstLine="720"/>
-        <w:jc w:val="center"/>
-        <w:rPr>
-          <w:rFonts w:ascii="Times New Roman" w:eastAsia="Times New Roman" w:hAnsi="Times New Roman" w:cs="Times New Roman"/>
-          <w:b/>
-          <w:sz w:val="26"/>
-          <w:szCs w:val="26"/>
-          <w:lang w:val="it-IT"/>
-        </w:rPr>
-      </w:pPr>
-    </w:p>
-    <w:p>
-      <w:pPr>
-        <w:spacing w:after="0" w:line="288" w:lineRule="auto"/>
-        <w:ind w:firstLine="720"/>
-        <w:jc w:val="center"/>
-        <w:rPr>
-          <w:rFonts w:ascii="Times New Roman" w:eastAsia="Times New Roman" w:hAnsi="Times New Roman" w:cs="Times New Roman"/>
-          <w:b/>
-          <w:sz w:val="26"/>
-          <w:szCs w:val="26"/>
-          <w:lang w:val="it-IT"/>
-        </w:rPr>
-      </w:pPr>
-    </w:p>
-    <w:p>
-      <w:pPr>
-        <w:spacing w:after="0" w:line="288" w:lineRule="auto"/>
-        <w:ind w:firstLine="720"/>
-        <w:jc w:val="center"/>
-        <w:rPr>
-          <w:rFonts w:ascii="Times New Roman" w:eastAsia="Times New Roman" w:hAnsi="Times New Roman" w:cs="Times New Roman"/>
-          <w:b/>
-          <w:sz w:val="26"/>
-          <w:szCs w:val="26"/>
-          <w:lang w:val="it-IT"/>
-        </w:rPr>
-      </w:pPr>
-    </w:p>
-    <w:p>
-      <w:pPr>
-        <w:spacing w:after="0" w:line="288" w:lineRule="auto"/>
-        <w:ind w:firstLine="720"/>
-        <w:jc w:val="center"/>
-        <w:rPr>
-          <w:rFonts w:ascii="Times New Roman" w:eastAsia="Times New Roman" w:hAnsi="Times New Roman" w:cs="Times New Roman"/>
-          <w:b/>
-          <w:sz w:val="26"/>
-          <w:szCs w:val="26"/>
-          <w:lang w:val="it-IT"/>
-        </w:rPr>
-      </w:pPr>
+          <w:sz w:val="26"/>
+          <w:szCs w:val="26"/>
+          <w:lang w:val="it-IT"/>
+        </w:rPr>
+      </w:pPr>
+      <w:bookmarkStart w:id="1" w:name="_GoBack"/>
+      <w:bookmarkEnd w:id="1"/>
     </w:p>
     <w:p>
       <w:pPr>

</xml_diff>